<commit_message>
Format Unit 1 notes adhering strictly to original text from notes (GFM).docx
</commit_message>
<xml_diff>
--- a/Global Financial Management/notes (GFM).docx
+++ b/Global Financial Management/notes (GFM).docx
@@ -100,7 +100,15 @@
         </w:numPr>
       </w:pPr>
       <w:r>
-        <w:t xml:space="preserve">Guarantee, Risk management products, advisory services for middle income and credit worthy and low income countries </w:t>
+        <w:t xml:space="preserve">Guarantee, Risk management products, advisory services for middle income and credit worthy and </w:t>
+      </w:r>
+      <w:proofErr w:type="gramStart"/>
+      <w:r>
+        <w:t>low income</w:t>
+      </w:r>
+      <w:proofErr w:type="gramEnd"/>
+      <w:r>
+        <w:t xml:space="preserve"> countries </w:t>
       </w:r>
     </w:p>
     <w:p>
@@ -428,7 +436,13 @@
         <w:ind w:left="0"/>
       </w:pPr>
       <w:r>
-        <w:t>21/06/2026</w:t>
+        <w:t>21/0</w:t>
+      </w:r>
+      <w:r>
+        <w:t>8</w:t>
+      </w:r>
+      <w:r>
+        <w:t>/2026</w:t>
       </w:r>
     </w:p>
     <w:p>

</xml_diff>

<commit_message>
Integrate lecture notes for 02/09/2026: SDR, ADB, and comparative analysis with TikZ flowcharts
</commit_message>
<xml_diff>
--- a/Global Financial Management/notes (GFM).docx
+++ b/Global Financial Management/notes (GFM).docx
@@ -100,7 +100,15 @@
         </w:numPr>
       </w:pPr>
       <w:r>
-        <w:t xml:space="preserve">Guarantee, Risk management products, advisory services for middle income and credit worthy and low income countries </w:t>
+        <w:t xml:space="preserve">Guarantee, Risk management products, advisory services for middle income and credit worthy and </w:t>
+      </w:r>
+      <w:proofErr w:type="gramStart"/>
+      <w:r>
+        <w:t>low income</w:t>
+      </w:r>
+      <w:proofErr w:type="gramEnd"/>
+      <w:r>
+        <w:t xml:space="preserve"> countries </w:t>
       </w:r>
     </w:p>
     <w:p>
@@ -1782,6 +1790,7 @@
         </w:numPr>
       </w:pPr>
       <w:r>
+        <w:lastRenderedPageBreak/>
         <w:t xml:space="preserve">Increase exports </w:t>
       </w:r>
     </w:p>
@@ -1794,7 +1803,6 @@
         </w:numPr>
       </w:pPr>
       <w:r>
-        <w:lastRenderedPageBreak/>
         <w:t xml:space="preserve">Reduce unnecessary imports </w:t>
       </w:r>
     </w:p>
@@ -1904,6 +1912,1027 @@
       <w:r>
         <w:t xml:space="preserve">Capacity development </w:t>
       </w:r>
+    </w:p>
+    <w:p/>
+    <w:p/>
+    <w:p>
+      <w:r>
+        <w:t>02/09/2026</w:t>
+      </w:r>
+    </w:p>
+    <w:p/>
+    <w:p>
+      <w:pPr>
+        <w:pStyle w:val="ListParagraph"/>
+        <w:numPr>
+          <w:ilvl w:val="0"/>
+          <w:numId w:val="11"/>
+        </w:numPr>
+      </w:pPr>
+      <w:r>
+        <w:t>Special drawing rights (SDR)</w:t>
+      </w:r>
+    </w:p>
+    <w:p>
+      <w:pPr>
+        <w:pStyle w:val="ListParagraph"/>
+        <w:numPr>
+          <w:ilvl w:val="1"/>
+          <w:numId w:val="11"/>
+        </w:numPr>
+      </w:pPr>
+      <w:r>
+        <w:t xml:space="preserve">Not a currency </w:t>
+      </w:r>
+    </w:p>
+    <w:p>
+      <w:pPr>
+        <w:pStyle w:val="ListParagraph"/>
+        <w:numPr>
+          <w:ilvl w:val="1"/>
+          <w:numId w:val="11"/>
+        </w:numPr>
+      </w:pPr>
+      <w:r>
+        <w:t>An international reserve asset</w:t>
+      </w:r>
+    </w:p>
+    <w:p>
+      <w:pPr>
+        <w:pStyle w:val="ListParagraph"/>
+        <w:numPr>
+          <w:ilvl w:val="1"/>
+          <w:numId w:val="11"/>
+        </w:numPr>
+      </w:pPr>
+      <w:r>
+        <w:t>Created by IMF</w:t>
+      </w:r>
+    </w:p>
+    <w:p>
+      <w:pPr>
+        <w:pStyle w:val="ListParagraph"/>
+        <w:numPr>
+          <w:ilvl w:val="0"/>
+          <w:numId w:val="11"/>
+        </w:numPr>
+      </w:pPr>
+      <w:r>
+        <w:t xml:space="preserve">Purpose </w:t>
+      </w:r>
+    </w:p>
+    <w:p>
+      <w:pPr>
+        <w:pStyle w:val="ListParagraph"/>
+        <w:numPr>
+          <w:ilvl w:val="1"/>
+          <w:numId w:val="11"/>
+        </w:numPr>
+      </w:pPr>
+      <w:r>
+        <w:t xml:space="preserve">To supplement countries official foreign exchange reserves </w:t>
+      </w:r>
+    </w:p>
+    <w:p>
+      <w:pPr>
+        <w:pStyle w:val="ListParagraph"/>
+        <w:numPr>
+          <w:ilvl w:val="1"/>
+          <w:numId w:val="11"/>
+        </w:numPr>
+      </w:pPr>
+      <w:r>
+        <w:t>To provide international liquidity</w:t>
+      </w:r>
+    </w:p>
+    <w:p>
+      <w:pPr>
+        <w:pStyle w:val="ListParagraph"/>
+        <w:numPr>
+          <w:ilvl w:val="1"/>
+          <w:numId w:val="11"/>
+        </w:numPr>
+      </w:pPr>
+      <w:r>
+        <w:t>To strengthen countries external financial position</w:t>
+      </w:r>
+    </w:p>
+    <w:p>
+      <w:pPr>
+        <w:pStyle w:val="ListParagraph"/>
+        <w:numPr>
+          <w:ilvl w:val="1"/>
+          <w:numId w:val="11"/>
+        </w:numPr>
+      </w:pPr>
+      <w:r>
+        <w:t>To help countries meet BOP needs</w:t>
+      </w:r>
+    </w:p>
+    <w:p>
+      <w:pPr>
+        <w:pStyle w:val="ListParagraph"/>
+        <w:numPr>
+          <w:ilvl w:val="0"/>
+          <w:numId w:val="11"/>
+        </w:numPr>
+      </w:pPr>
+      <w:r>
+        <w:t>SDR basket of countries</w:t>
+      </w:r>
+    </w:p>
+    <w:p>
+      <w:pPr>
+        <w:pStyle w:val="ListParagraph"/>
+        <w:numPr>
+          <w:ilvl w:val="1"/>
+          <w:numId w:val="11"/>
+        </w:numPr>
+      </w:pPr>
+      <w:r>
+        <w:t>Value of SDR is based on basket of five major currencies</w:t>
+      </w:r>
+    </w:p>
+    <w:tbl>
+      <w:tblPr>
+        <w:tblStyle w:val="TableGrid"/>
+        <w:tblW w:w="0" w:type="auto"/>
+        <w:tblInd w:w="1440" w:type="dxa"/>
+        <w:tblLook w:val="04A0" w:firstRow="1" w:lastRow="0" w:firstColumn="1" w:lastColumn="0" w:noHBand="0" w:noVBand="1"/>
+      </w:tblPr>
+      <w:tblGrid>
+        <w:gridCol w:w="3809"/>
+        <w:gridCol w:w="3767"/>
+      </w:tblGrid>
+      <w:tr>
+        <w:tc>
+          <w:tcPr>
+            <w:tcW w:w="3809" w:type="dxa"/>
+          </w:tcPr>
+          <w:p>
+            <w:pPr>
+              <w:pStyle w:val="ListParagraph"/>
+              <w:numPr>
+                <w:ilvl w:val="1"/>
+                <w:numId w:val="11"/>
+              </w:numPr>
+              <w:ind w:left="0" w:firstLine="0"/>
+            </w:pPr>
+            <w:r>
+              <w:t>Currency</w:t>
+            </w:r>
+          </w:p>
+        </w:tc>
+        <w:tc>
+          <w:tcPr>
+            <w:tcW w:w="3767" w:type="dxa"/>
+          </w:tcPr>
+          <w:p>
+            <w:pPr>
+              <w:pStyle w:val="ListParagraph"/>
+              <w:numPr>
+                <w:ilvl w:val="1"/>
+                <w:numId w:val="11"/>
+              </w:numPr>
+              <w:ind w:left="0" w:firstLine="0"/>
+            </w:pPr>
+            <w:r>
+              <w:t>Approx. weightage</w:t>
+            </w:r>
+          </w:p>
+        </w:tc>
+      </w:tr>
+      <w:tr>
+        <w:tc>
+          <w:tcPr>
+            <w:tcW w:w="3809" w:type="dxa"/>
+          </w:tcPr>
+          <w:p>
+            <w:pPr>
+              <w:pStyle w:val="ListParagraph"/>
+              <w:numPr>
+                <w:ilvl w:val="1"/>
+                <w:numId w:val="11"/>
+              </w:numPr>
+              <w:ind w:left="0" w:firstLine="0"/>
+            </w:pPr>
+            <w:r>
+              <w:t>USD</w:t>
+            </w:r>
+          </w:p>
+          <w:p>
+            <w:pPr>
+              <w:pStyle w:val="ListParagraph"/>
+              <w:numPr>
+                <w:ilvl w:val="1"/>
+                <w:numId w:val="11"/>
+              </w:numPr>
+              <w:ind w:left="0" w:firstLine="0"/>
+            </w:pPr>
+            <w:r>
+              <w:t>EUR</w:t>
+            </w:r>
+          </w:p>
+          <w:p>
+            <w:pPr>
+              <w:pStyle w:val="ListParagraph"/>
+              <w:numPr>
+                <w:ilvl w:val="1"/>
+                <w:numId w:val="11"/>
+              </w:numPr>
+              <w:ind w:left="0" w:firstLine="0"/>
+            </w:pPr>
+            <w:r>
+              <w:t>CNY</w:t>
+            </w:r>
+          </w:p>
+          <w:p>
+            <w:pPr>
+              <w:pStyle w:val="ListParagraph"/>
+              <w:numPr>
+                <w:ilvl w:val="1"/>
+                <w:numId w:val="11"/>
+              </w:numPr>
+              <w:ind w:left="0" w:firstLine="0"/>
+            </w:pPr>
+            <w:r>
+              <w:t xml:space="preserve">JPY </w:t>
+            </w:r>
+          </w:p>
+          <w:p>
+            <w:pPr>
+              <w:pStyle w:val="ListParagraph"/>
+              <w:numPr>
+                <w:ilvl w:val="1"/>
+                <w:numId w:val="11"/>
+              </w:numPr>
+              <w:ind w:left="0" w:firstLine="0"/>
+            </w:pPr>
+            <w:r>
+              <w:t>GBP</w:t>
+            </w:r>
+          </w:p>
+        </w:tc>
+        <w:tc>
+          <w:tcPr>
+            <w:tcW w:w="3767" w:type="dxa"/>
+          </w:tcPr>
+          <w:p>
+            <w:pPr>
+              <w:pStyle w:val="ListParagraph"/>
+              <w:numPr>
+                <w:ilvl w:val="1"/>
+                <w:numId w:val="11"/>
+              </w:numPr>
+              <w:ind w:left="0" w:firstLine="0"/>
+            </w:pPr>
+            <w:r>
+              <w:t>43.39%</w:t>
+            </w:r>
+          </w:p>
+          <w:p>
+            <w:pPr>
+              <w:pStyle w:val="ListParagraph"/>
+              <w:numPr>
+                <w:ilvl w:val="1"/>
+                <w:numId w:val="11"/>
+              </w:numPr>
+              <w:ind w:left="0" w:firstLine="0"/>
+            </w:pPr>
+            <w:r>
+              <w:t>29.31%</w:t>
+            </w:r>
+          </w:p>
+          <w:p>
+            <w:pPr>
+              <w:pStyle w:val="ListParagraph"/>
+              <w:numPr>
+                <w:ilvl w:val="1"/>
+                <w:numId w:val="11"/>
+              </w:numPr>
+              <w:ind w:left="0" w:firstLine="0"/>
+            </w:pPr>
+            <w:r>
+              <w:t>12.28%</w:t>
+            </w:r>
+          </w:p>
+          <w:p>
+            <w:pPr>
+              <w:pStyle w:val="ListParagraph"/>
+              <w:numPr>
+                <w:ilvl w:val="1"/>
+                <w:numId w:val="11"/>
+              </w:numPr>
+              <w:ind w:left="0" w:firstLine="0"/>
+            </w:pPr>
+            <w:r>
+              <w:t>7.59%</w:t>
+            </w:r>
+          </w:p>
+          <w:p>
+            <w:pPr>
+              <w:pStyle w:val="ListParagraph"/>
+              <w:numPr>
+                <w:ilvl w:val="1"/>
+                <w:numId w:val="11"/>
+              </w:numPr>
+              <w:ind w:left="0" w:firstLine="0"/>
+            </w:pPr>
+            <w:r>
+              <w:t>7.44%</w:t>
+            </w:r>
+          </w:p>
+        </w:tc>
+      </w:tr>
+    </w:tbl>
+    <w:p>
+      <w:pPr>
+        <w:pStyle w:val="ListParagraph"/>
+        <w:numPr>
+          <w:ilvl w:val="0"/>
+          <w:numId w:val="13"/>
+        </w:numPr>
+      </w:pPr>
+      <w:r>
+        <w:t>Allocation of SDRs</w:t>
+      </w:r>
+    </w:p>
+    <w:p>
+      <w:pPr>
+        <w:pStyle w:val="ListParagraph"/>
+        <w:numPr>
+          <w:ilvl w:val="1"/>
+          <w:numId w:val="13"/>
+        </w:numPr>
+      </w:pPr>
+      <w:r>
+        <w:t xml:space="preserve">SDRs are allocated to IMF member countries in proportion of their IMF quotas </w:t>
+      </w:r>
+    </w:p>
+    <w:p>
+      <w:pPr>
+        <w:pStyle w:val="ListParagraph"/>
+        <w:numPr>
+          <w:ilvl w:val="0"/>
+          <w:numId w:val="13"/>
+        </w:numPr>
+      </w:pPr>
+      <w:r>
+        <w:t>SDR interest</w:t>
+      </w:r>
+    </w:p>
+    <w:p>
+      <w:pPr>
+        <w:pStyle w:val="ListParagraph"/>
+        <w:numPr>
+          <w:ilvl w:val="1"/>
+          <w:numId w:val="13"/>
+        </w:numPr>
+      </w:pPr>
+      <w:r>
+        <w:t>Objectives</w:t>
+      </w:r>
+    </w:p>
+    <w:p>
+      <w:pPr>
+        <w:pStyle w:val="ListParagraph"/>
+        <w:numPr>
+          <w:ilvl w:val="2"/>
+          <w:numId w:val="13"/>
+        </w:numPr>
+      </w:pPr>
+      <w:r>
+        <w:t>Increase foreign exchange reserves</w:t>
+      </w:r>
+    </w:p>
+    <w:p>
+      <w:pPr>
+        <w:pStyle w:val="ListParagraph"/>
+        <w:numPr>
+          <w:ilvl w:val="2"/>
+          <w:numId w:val="13"/>
+        </w:numPr>
+      </w:pPr>
+      <w:r>
+        <w:lastRenderedPageBreak/>
+        <w:t xml:space="preserve">Improve liquidity during crisis </w:t>
+      </w:r>
+    </w:p>
+    <w:p>
+      <w:pPr>
+        <w:pStyle w:val="ListParagraph"/>
+        <w:numPr>
+          <w:ilvl w:val="2"/>
+          <w:numId w:val="13"/>
+        </w:numPr>
+      </w:pPr>
+      <w:r>
+        <w:t xml:space="preserve">Reduce pressure on forex reserve </w:t>
+      </w:r>
+    </w:p>
+    <w:p>
+      <w:pPr>
+        <w:pStyle w:val="ListParagraph"/>
+        <w:numPr>
+          <w:ilvl w:val="2"/>
+          <w:numId w:val="13"/>
+        </w:numPr>
+      </w:pPr>
+      <w:r>
+        <w:t>Support of BOP</w:t>
+      </w:r>
+    </w:p>
+    <w:p>
+      <w:r>
+        <w:t xml:space="preserve"> </w:t>
+      </w:r>
+    </w:p>
+    <w:p>
+      <w:r>
+        <w:t xml:space="preserve">  ADB (Asian Development Bank)</w:t>
+      </w:r>
+    </w:p>
+    <w:tbl>
+      <w:tblPr>
+        <w:tblStyle w:val="TableGrid"/>
+        <w:tblW w:w="0" w:type="auto"/>
+        <w:tblLook w:val="04A0" w:firstRow="1" w:lastRow="0" w:firstColumn="1" w:lastColumn="0" w:noHBand="0" w:noVBand="1"/>
+      </w:tblPr>
+      <w:tblGrid>
+        <w:gridCol w:w="4508"/>
+        <w:gridCol w:w="4508"/>
+      </w:tblGrid>
+      <w:tr>
+        <w:tc>
+          <w:tcPr>
+            <w:tcW w:w="4508" w:type="dxa"/>
+          </w:tcPr>
+          <w:p>
+            <w:r>
+              <w:t xml:space="preserve">Established </w:t>
+            </w:r>
+          </w:p>
+        </w:tc>
+        <w:tc>
+          <w:tcPr>
+            <w:tcW w:w="4508" w:type="dxa"/>
+          </w:tcPr>
+          <w:p>
+            <w:r>
+              <w:t>1966</w:t>
+            </w:r>
+          </w:p>
+        </w:tc>
+      </w:tr>
+      <w:tr>
+        <w:tc>
+          <w:tcPr>
+            <w:tcW w:w="4508" w:type="dxa"/>
+          </w:tcPr>
+          <w:p>
+            <w:r>
+              <w:t>Headquarter</w:t>
+            </w:r>
+          </w:p>
+        </w:tc>
+        <w:tc>
+          <w:tcPr>
+            <w:tcW w:w="4508" w:type="dxa"/>
+          </w:tcPr>
+          <w:p>
+            <w:r>
+              <w:t>Manila (Philippines)</w:t>
+            </w:r>
+          </w:p>
+        </w:tc>
+      </w:tr>
+      <w:tr>
+        <w:tc>
+          <w:tcPr>
+            <w:tcW w:w="4508" w:type="dxa"/>
+          </w:tcPr>
+          <w:p>
+            <w:r>
+              <w:t>Nature</w:t>
+            </w:r>
+          </w:p>
+        </w:tc>
+        <w:tc>
+          <w:tcPr>
+            <w:tcW w:w="4508" w:type="dxa"/>
+          </w:tcPr>
+          <w:p>
+            <w:r>
+              <w:t>Multilateral development bank</w:t>
+            </w:r>
+          </w:p>
+        </w:tc>
+      </w:tr>
+      <w:tr>
+        <w:tc>
+          <w:tcPr>
+            <w:tcW w:w="4508" w:type="dxa"/>
+          </w:tcPr>
+          <w:p>
+            <w:r>
+              <w:t>Major region</w:t>
+            </w:r>
+          </w:p>
+        </w:tc>
+        <w:tc>
+          <w:tcPr>
+            <w:tcW w:w="4508" w:type="dxa"/>
+          </w:tcPr>
+          <w:p>
+            <w:r>
+              <w:t>Asia &amp; pacific</w:t>
+            </w:r>
+          </w:p>
+        </w:tc>
+      </w:tr>
+    </w:tbl>
+    <w:p/>
+    <w:p>
+      <w:r>
+        <w:t>Objective</w:t>
+      </w:r>
+    </w:p>
+    <w:p>
+      <w:pPr>
+        <w:pStyle w:val="ListParagraph"/>
+        <w:numPr>
+          <w:ilvl w:val="0"/>
+          <w:numId w:val="14"/>
+        </w:numPr>
+      </w:pPr>
+      <w:r>
+        <w:t xml:space="preserve">Inclusive </w:t>
+      </w:r>
+    </w:p>
+    <w:p>
+      <w:pPr>
+        <w:pStyle w:val="ListParagraph"/>
+        <w:numPr>
+          <w:ilvl w:val="0"/>
+          <w:numId w:val="14"/>
+        </w:numPr>
+      </w:pPr>
+      <w:r>
+        <w:t>Sustainable</w:t>
+      </w:r>
+    </w:p>
+    <w:p>
+      <w:pPr>
+        <w:pStyle w:val="ListParagraph"/>
+        <w:numPr>
+          <w:ilvl w:val="0"/>
+          <w:numId w:val="14"/>
+        </w:numPr>
+      </w:pPr>
+      <w:r>
+        <w:t>Economic</w:t>
+      </w:r>
+    </w:p>
+    <w:p>
+      <w:pPr>
+        <w:pStyle w:val="ListParagraph"/>
+        <w:numPr>
+          <w:ilvl w:val="0"/>
+          <w:numId w:val="14"/>
+        </w:numPr>
+      </w:pPr>
+      <w:r>
+        <w:t>Development</w:t>
+      </w:r>
+    </w:p>
+    <w:p/>
+    <w:p>
+      <w:r>
+        <w:t>Activities</w:t>
+      </w:r>
+    </w:p>
+    <w:p>
+      <w:pPr>
+        <w:pStyle w:val="ListParagraph"/>
+        <w:numPr>
+          <w:ilvl w:val="0"/>
+          <w:numId w:val="15"/>
+        </w:numPr>
+      </w:pPr>
+      <w:r>
+        <w:t>Loans</w:t>
+      </w:r>
+    </w:p>
+    <w:p>
+      <w:pPr>
+        <w:pStyle w:val="ListParagraph"/>
+        <w:numPr>
+          <w:ilvl w:val="0"/>
+          <w:numId w:val="15"/>
+        </w:numPr>
+      </w:pPr>
+      <w:r>
+        <w:t>Grants</w:t>
+      </w:r>
+    </w:p>
+    <w:p>
+      <w:pPr>
+        <w:pStyle w:val="ListParagraph"/>
+        <w:numPr>
+          <w:ilvl w:val="0"/>
+          <w:numId w:val="15"/>
+        </w:numPr>
+      </w:pPr>
+      <w:r>
+        <w:t xml:space="preserve">Technical assistance </w:t>
+      </w:r>
+    </w:p>
+    <w:p>
+      <w:pPr>
+        <w:pStyle w:val="ListParagraph"/>
+        <w:numPr>
+          <w:ilvl w:val="0"/>
+          <w:numId w:val="15"/>
+        </w:numPr>
+      </w:pPr>
+      <w:r>
+        <w:t>Policy support</w:t>
+      </w:r>
+    </w:p>
+    <w:p>
+      <w:r>
+        <w:t>India is member of ADB since 1966</w:t>
+      </w:r>
+    </w:p>
+    <w:p>
+      <w:r>
+        <w:t>Objective</w:t>
+      </w:r>
+    </w:p>
+    <w:p>
+      <w:pPr>
+        <w:pStyle w:val="ListParagraph"/>
+        <w:numPr>
+          <w:ilvl w:val="0"/>
+          <w:numId w:val="16"/>
+        </w:numPr>
+      </w:pPr>
+      <w:r>
+        <w:t>Reduce poverty</w:t>
+      </w:r>
+    </w:p>
+    <w:p>
+      <w:pPr>
+        <w:pStyle w:val="ListParagraph"/>
+        <w:numPr>
+          <w:ilvl w:val="0"/>
+          <w:numId w:val="16"/>
+        </w:numPr>
+      </w:pPr>
+      <w:r>
+        <w:t>Promote economic growth</w:t>
+      </w:r>
+    </w:p>
+    <w:p>
+      <w:pPr>
+        <w:pStyle w:val="ListParagraph"/>
+        <w:numPr>
+          <w:ilvl w:val="0"/>
+          <w:numId w:val="16"/>
+        </w:numPr>
+      </w:pPr>
+      <w:r>
+        <w:t>Support infrastructure development (</w:t>
+      </w:r>
+      <w:proofErr w:type="spellStart"/>
+      <w:r>
+        <w:t>eg.</w:t>
+      </w:r>
+      <w:proofErr w:type="spellEnd"/>
+      <w:r>
+        <w:t xml:space="preserve"> Transport, energy)</w:t>
+      </w:r>
+    </w:p>
+    <w:p>
+      <w:pPr>
+        <w:pStyle w:val="ListParagraph"/>
+        <w:numPr>
+          <w:ilvl w:val="0"/>
+          <w:numId w:val="16"/>
+        </w:numPr>
+      </w:pPr>
+      <w:r>
+        <w:t>Encourage regional co-operation</w:t>
+      </w:r>
+    </w:p>
+    <w:p>
+      <w:pPr>
+        <w:pStyle w:val="ListParagraph"/>
+        <w:numPr>
+          <w:ilvl w:val="0"/>
+          <w:numId w:val="16"/>
+        </w:numPr>
+      </w:pPr>
+      <w:r>
+        <w:t xml:space="preserve">Promote environment sustainability and climate change </w:t>
+      </w:r>
+    </w:p>
+    <w:p>
+      <w:pPr>
+        <w:pStyle w:val="ListParagraph"/>
+        <w:numPr>
+          <w:ilvl w:val="0"/>
+          <w:numId w:val="16"/>
+        </w:numPr>
+      </w:pPr>
+      <w:r>
+        <w:t>Improve education, health and social development</w:t>
+      </w:r>
+    </w:p>
+    <w:p>
+      <w:r>
+        <w:t xml:space="preserve">ADB and India </w:t>
+      </w:r>
+    </w:p>
+    <w:p>
+      <w:pPr>
+        <w:pStyle w:val="ListParagraph"/>
+        <w:numPr>
+          <w:ilvl w:val="0"/>
+          <w:numId w:val="17"/>
+        </w:numPr>
+      </w:pPr>
+      <w:r>
+        <w:t xml:space="preserve">Urban infrastructure </w:t>
+      </w:r>
+    </w:p>
+    <w:p>
+      <w:pPr>
+        <w:pStyle w:val="ListParagraph"/>
+        <w:numPr>
+          <w:ilvl w:val="0"/>
+          <w:numId w:val="17"/>
+        </w:numPr>
+      </w:pPr>
+      <w:r>
+        <w:t xml:space="preserve">Transport and roads </w:t>
+      </w:r>
+    </w:p>
+    <w:p>
+      <w:pPr>
+        <w:pStyle w:val="ListParagraph"/>
+        <w:numPr>
+          <w:ilvl w:val="0"/>
+          <w:numId w:val="17"/>
+        </w:numPr>
+      </w:pPr>
+      <w:r>
+        <w:t xml:space="preserve">Renewable energy </w:t>
+      </w:r>
+    </w:p>
+    <w:p>
+      <w:pPr>
+        <w:pStyle w:val="ListParagraph"/>
+        <w:numPr>
+          <w:ilvl w:val="0"/>
+          <w:numId w:val="17"/>
+        </w:numPr>
+      </w:pPr>
+      <w:r>
+        <w:t xml:space="preserve">Water and sanitation </w:t>
+      </w:r>
+    </w:p>
+    <w:p>
+      <w:pPr>
+        <w:pStyle w:val="ListParagraph"/>
+        <w:numPr>
+          <w:ilvl w:val="0"/>
+          <w:numId w:val="17"/>
+        </w:numPr>
+      </w:pPr>
+      <w:r>
+        <w:lastRenderedPageBreak/>
+        <w:t>Skill development</w:t>
+      </w:r>
+    </w:p>
+    <w:p>
+      <w:pPr>
+        <w:pStyle w:val="ListParagraph"/>
+        <w:numPr>
+          <w:ilvl w:val="0"/>
+          <w:numId w:val="17"/>
+        </w:numPr>
+      </w:pPr>
+      <w:r>
+        <w:t xml:space="preserve">Climate resilient development </w:t>
+      </w:r>
+    </w:p>
+    <w:p/>
+    <w:p>
+      <w:r>
+        <w:t xml:space="preserve">ADB vs </w:t>
+      </w:r>
+      <w:r>
+        <w:t>IMF</w:t>
+      </w:r>
+    </w:p>
+    <w:p>
+      <w:r>
+        <w:t>ADB -&gt; regional development</w:t>
+      </w:r>
+    </w:p>
+    <w:p>
+      <w:r>
+        <w:t xml:space="preserve">IMF -&gt; global monetary stability </w:t>
+      </w:r>
+    </w:p>
+    <w:tbl>
+      <w:tblPr>
+        <w:tblStyle w:val="TableGrid"/>
+        <w:tblW w:w="0" w:type="auto"/>
+        <w:tblInd w:w="720" w:type="dxa"/>
+        <w:tblLook w:val="04A0" w:firstRow="1" w:lastRow="0" w:firstColumn="1" w:lastColumn="0" w:noHBand="0" w:noVBand="1"/>
+      </w:tblPr>
+      <w:tblGrid>
+        <w:gridCol w:w="4148"/>
+        <w:gridCol w:w="4148"/>
+      </w:tblGrid>
+      <w:tr>
+        <w:tc>
+          <w:tcPr>
+            <w:tcW w:w="4148" w:type="dxa"/>
+          </w:tcPr>
+          <w:p>
+            <w:pPr>
+              <w:pStyle w:val="ListParagraph"/>
+              <w:ind w:left="0"/>
+            </w:pPr>
+            <w:r>
+              <w:rPr>
+                <w:rFonts w:ascii="Calibri" w:eastAsia="Times New Roman" w:hAnsi="Calibri" w:cs="Calibri"/>
+                <w:color w:val="000000"/>
+                <w:kern w:val="0"/>
+                <w:sz w:val="22"/>
+                <w:szCs w:val="22"/>
+                <w:lang w:eastAsia="en-IN"/>
+                <w14:ligatures w14:val="none"/>
+              </w:rPr>
+              <w:t xml:space="preserve">regional </w:t>
+            </w:r>
+            <w:proofErr w:type="spellStart"/>
+            <w:r>
+              <w:rPr>
+                <w:rFonts w:ascii="Calibri" w:eastAsia="Times New Roman" w:hAnsi="Calibri" w:cs="Calibri"/>
+                <w:color w:val="000000"/>
+                <w:kern w:val="0"/>
+                <w:sz w:val="22"/>
+                <w:szCs w:val="22"/>
+                <w:lang w:eastAsia="en-IN"/>
+                <w14:ligatures w14:val="none"/>
+              </w:rPr>
+              <w:t>instituition</w:t>
+            </w:r>
+            <w:proofErr w:type="spellEnd"/>
+          </w:p>
+        </w:tc>
+        <w:tc>
+          <w:tcPr>
+            <w:tcW w:w="4148" w:type="dxa"/>
+          </w:tcPr>
+          <w:p>
+            <w:pPr>
+              <w:pStyle w:val="ListParagraph"/>
+              <w:ind w:left="0"/>
+            </w:pPr>
+            <w:r>
+              <w:rPr>
+                <w:rFonts w:ascii="Calibri" w:eastAsia="Times New Roman" w:hAnsi="Calibri" w:cs="Calibri"/>
+                <w:color w:val="000000"/>
+                <w:kern w:val="0"/>
+                <w:sz w:val="22"/>
+                <w:szCs w:val="22"/>
+                <w:lang w:eastAsia="en-IN"/>
+                <w14:ligatures w14:val="none"/>
+              </w:rPr>
+              <w:t xml:space="preserve">global </w:t>
+            </w:r>
+            <w:proofErr w:type="spellStart"/>
+            <w:r>
+              <w:rPr>
+                <w:rFonts w:ascii="Calibri" w:eastAsia="Times New Roman" w:hAnsi="Calibri" w:cs="Calibri"/>
+                <w:color w:val="000000"/>
+                <w:kern w:val="0"/>
+                <w:sz w:val="22"/>
+                <w:szCs w:val="22"/>
+                <w:lang w:eastAsia="en-IN"/>
+                <w14:ligatures w14:val="none"/>
+              </w:rPr>
+              <w:t>instituition</w:t>
+            </w:r>
+            <w:proofErr w:type="spellEnd"/>
+          </w:p>
+        </w:tc>
+      </w:tr>
+      <w:tr>
+        <w:trPr>
+          <w:trHeight w:val="300"/>
+        </w:trPr>
+        <w:tc>
+          <w:tcPr>
+            <w:tcW w:w="4148" w:type="dxa"/>
+            <w:noWrap/>
+            <w:hideMark/>
+          </w:tcPr>
+          <w:p>
+            <w:pPr>
+              <w:rPr>
+                <w:rFonts w:ascii="Calibri" w:eastAsia="Times New Roman" w:hAnsi="Calibri" w:cs="Calibri"/>
+                <w:color w:val="000000"/>
+                <w:kern w:val="0"/>
+                <w:sz w:val="22"/>
+                <w:szCs w:val="22"/>
+                <w:lang w:eastAsia="en-IN"/>
+                <w14:ligatures w14:val="none"/>
+              </w:rPr>
+            </w:pPr>
+            <w:r>
+              <w:rPr>
+                <w:rFonts w:ascii="Calibri" w:eastAsia="Times New Roman" w:hAnsi="Calibri" w:cs="Calibri"/>
+                <w:color w:val="000000"/>
+                <w:kern w:val="0"/>
+                <w:sz w:val="22"/>
+                <w:szCs w:val="22"/>
+                <w:lang w:eastAsia="en-IN"/>
+                <w14:ligatures w14:val="none"/>
+              </w:rPr>
+              <w:t>support development</w:t>
+            </w:r>
+          </w:p>
+        </w:tc>
+        <w:tc>
+          <w:tcPr>
+            <w:tcW w:w="4148" w:type="dxa"/>
+            <w:noWrap/>
+            <w:hideMark/>
+          </w:tcPr>
+          <w:p>
+            <w:pPr>
+              <w:rPr>
+                <w:rFonts w:ascii="Calibri" w:eastAsia="Times New Roman" w:hAnsi="Calibri" w:cs="Calibri"/>
+                <w:color w:val="000000"/>
+                <w:kern w:val="0"/>
+                <w:sz w:val="22"/>
+                <w:szCs w:val="22"/>
+                <w:lang w:eastAsia="en-IN"/>
+                <w14:ligatures w14:val="none"/>
+              </w:rPr>
+            </w:pPr>
+            <w:r>
+              <w:rPr>
+                <w:rFonts w:ascii="Calibri" w:eastAsia="Times New Roman" w:hAnsi="Calibri" w:cs="Calibri"/>
+                <w:color w:val="000000"/>
+                <w:kern w:val="0"/>
+                <w:sz w:val="22"/>
+                <w:szCs w:val="22"/>
+                <w:lang w:eastAsia="en-IN"/>
+                <w14:ligatures w14:val="none"/>
+              </w:rPr>
+              <w:t xml:space="preserve">support BOP difficulties and macros economic </w:t>
+            </w:r>
+            <w:proofErr w:type="spellStart"/>
+            <w:r>
+              <w:rPr>
+                <w:rFonts w:ascii="Calibri" w:eastAsia="Times New Roman" w:hAnsi="Calibri" w:cs="Calibri"/>
+                <w:color w:val="000000"/>
+                <w:kern w:val="0"/>
+                <w:sz w:val="22"/>
+                <w:szCs w:val="22"/>
+                <w:lang w:eastAsia="en-IN"/>
+                <w14:ligatures w14:val="none"/>
+              </w:rPr>
+              <w:t>stablility</w:t>
+            </w:r>
+            <w:proofErr w:type="spellEnd"/>
+            <w:r>
+              <w:rPr>
+                <w:rFonts w:ascii="Calibri" w:eastAsia="Times New Roman" w:hAnsi="Calibri" w:cs="Calibri"/>
+                <w:color w:val="000000"/>
+                <w:kern w:val="0"/>
+                <w:sz w:val="22"/>
+                <w:szCs w:val="22"/>
+                <w:lang w:eastAsia="en-IN"/>
+                <w14:ligatures w14:val="none"/>
+              </w:rPr>
+              <w:t xml:space="preserve"> </w:t>
+            </w:r>
+          </w:p>
+        </w:tc>
+      </w:tr>
+    </w:tbl>
+    <w:p>
+      <w:pPr>
+        <w:pStyle w:val="ListParagraph"/>
+      </w:pPr>
     </w:p>
     <w:sectPr>
       <w:pgSz w:w="11906" w:h="16838"/>
@@ -1918,6 +2947,119 @@
 <file path=word/numbering.xml><?xml version="1.0" encoding="utf-8"?>
 <w:numbering xmlns:wpc="http://schemas.microsoft.com/office/word/2010/wordprocessingCanvas" xmlns:cx="http://schemas.microsoft.com/office/drawing/2014/chartex" xmlns:cx1="http://schemas.microsoft.com/office/drawing/2015/9/8/chartex" xmlns:cx2="http://schemas.microsoft.com/office/drawing/2015/10/21/chartex" xmlns:cx3="http://schemas.microsoft.com/office/drawing/2016/5/9/chartex" xmlns:cx4="http://schemas.microsoft.com/office/drawing/2016/5/10/chartex" xmlns:cx5="http://schemas.microsoft.com/office/drawing/2016/5/11/chartex" xmlns:cx6="http://schemas.microsoft.com/office/drawing/2016/5/12/chartex" xmlns:cx7="http://schemas.microsoft.com/office/drawing/2016/5/13/chartex" xmlns:cx8="http://schemas.microsoft.com/office/drawing/2016/5/14/chartex" xmlns:mc="http://schemas.openxmlformats.org/markup-compatibility/2006" xmlns:aink="http://schemas.microsoft.com/office/drawing/2016/ink" xmlns:am3d="http://schemas.microsoft.com/office/drawing/2017/model3d" xmlns:o="urn:schemas-microsoft-com:office:office" xmlns:oel="http://schemas.microsoft.com/office/2019/extlst" xmlns:r="http://schemas.openxmlformats.org/officeDocument/2006/relationships" xmlns:m="http://schemas.openxmlformats.org/officeDocument/2006/math" xmlns:v="urn:schemas-microsoft-com:vml" xmlns:wp14="http://schemas.microsoft.com/office/word/2010/wordprocessingDrawing" xmlns:wp="http://schemas.openxmlformats.org/drawingml/2006/wordprocessingDrawing" xmlns:w10="urn:schemas-microsoft-com:office:word" xmlns:w="http://schemas.openxmlformats.org/wordprocessingml/2006/main" xmlns:w14="http://schemas.microsoft.com/office/word/2010/wordml" xmlns:w15="http://schemas.microsoft.com/office/word/2012/wordml" xmlns:w16cex="http://schemas.microsoft.com/office/word/2018/wordml/cex" xmlns:w16cid="http://schemas.microsoft.com/office/word/2016/wordml/cid" xmlns:w16="http://schemas.microsoft.com/office/word/2018/wordml" xmlns:w16du="http://schemas.microsoft.com/office/word/2023/wordml/word16du" xmlns:w16sdtdh="http://schemas.microsoft.com/office/word/2020/wordml/sdtdatahash" xmlns:w16sdtfl="http://schemas.microsoft.com/office/word/2024/wordml/sdtformatlock" xmlns:w16se="http://schemas.microsoft.com/office/word/2015/wordml/symex" xmlns:wpg="http://schemas.microsoft.com/office/word/2010/wordprocessingGroup" xmlns:wpi="http://schemas.microsoft.com/office/word/2010/wordprocessingInk" xmlns:wne="http://schemas.microsoft.com/office/word/2006/wordml" xmlns:wps="http://schemas.microsoft.com/office/word/2010/wordprocessingShape" mc:Ignorable="w14 w15 w16se w16cid w16 w16cex w16sdtdh w16sdtfl w16du wp14">
   <w:abstractNum w:abstractNumId="0" w15:restartNumberingAfterBreak="0">
+    <w:nsid w:val="03935F16"/>
+    <w:multiLevelType w:val="hybridMultilevel"/>
+    <w:tmpl w:val="3C4EC7E0"/>
+    <w:lvl w:ilvl="0" w:tplc="40090001">
+      <w:start w:val="1"/>
+      <w:numFmt w:val="bullet"/>
+      <w:lvlText w:val=""/>
+      <w:lvlJc w:val="left"/>
+      <w:pPr>
+        <w:ind w:left="720" w:hanging="360"/>
+      </w:pPr>
+      <w:rPr>
+        <w:rFonts w:ascii="Symbol" w:hAnsi="Symbol" w:hint="default"/>
+      </w:rPr>
+    </w:lvl>
+    <w:lvl w:ilvl="1" w:tplc="40090003" w:tentative="1">
+      <w:start w:val="1"/>
+      <w:numFmt w:val="bullet"/>
+      <w:lvlText w:val="o"/>
+      <w:lvlJc w:val="left"/>
+      <w:pPr>
+        <w:ind w:left="1440" w:hanging="360"/>
+      </w:pPr>
+      <w:rPr>
+        <w:rFonts w:ascii="Courier New" w:hAnsi="Courier New" w:cs="Courier New" w:hint="default"/>
+      </w:rPr>
+    </w:lvl>
+    <w:lvl w:ilvl="2" w:tplc="40090005" w:tentative="1">
+      <w:start w:val="1"/>
+      <w:numFmt w:val="bullet"/>
+      <w:lvlText w:val=""/>
+      <w:lvlJc w:val="left"/>
+      <w:pPr>
+        <w:ind w:left="2160" w:hanging="360"/>
+      </w:pPr>
+      <w:rPr>
+        <w:rFonts w:ascii="Wingdings" w:hAnsi="Wingdings" w:hint="default"/>
+      </w:rPr>
+    </w:lvl>
+    <w:lvl w:ilvl="3" w:tplc="40090001" w:tentative="1">
+      <w:start w:val="1"/>
+      <w:numFmt w:val="bullet"/>
+      <w:lvlText w:val=""/>
+      <w:lvlJc w:val="left"/>
+      <w:pPr>
+        <w:ind w:left="2880" w:hanging="360"/>
+      </w:pPr>
+      <w:rPr>
+        <w:rFonts w:ascii="Symbol" w:hAnsi="Symbol" w:hint="default"/>
+      </w:rPr>
+    </w:lvl>
+    <w:lvl w:ilvl="4" w:tplc="40090003" w:tentative="1">
+      <w:start w:val="1"/>
+      <w:numFmt w:val="bullet"/>
+      <w:lvlText w:val="o"/>
+      <w:lvlJc w:val="left"/>
+      <w:pPr>
+        <w:ind w:left="3600" w:hanging="360"/>
+      </w:pPr>
+      <w:rPr>
+        <w:rFonts w:ascii="Courier New" w:hAnsi="Courier New" w:cs="Courier New" w:hint="default"/>
+      </w:rPr>
+    </w:lvl>
+    <w:lvl w:ilvl="5" w:tplc="40090005" w:tentative="1">
+      <w:start w:val="1"/>
+      <w:numFmt w:val="bullet"/>
+      <w:lvlText w:val=""/>
+      <w:lvlJc w:val="left"/>
+      <w:pPr>
+        <w:ind w:left="4320" w:hanging="360"/>
+      </w:pPr>
+      <w:rPr>
+        <w:rFonts w:ascii="Wingdings" w:hAnsi="Wingdings" w:hint="default"/>
+      </w:rPr>
+    </w:lvl>
+    <w:lvl w:ilvl="6" w:tplc="40090001" w:tentative="1">
+      <w:start w:val="1"/>
+      <w:numFmt w:val="bullet"/>
+      <w:lvlText w:val=""/>
+      <w:lvlJc w:val="left"/>
+      <w:pPr>
+        <w:ind w:left="5040" w:hanging="360"/>
+      </w:pPr>
+      <w:rPr>
+        <w:rFonts w:ascii="Symbol" w:hAnsi="Symbol" w:hint="default"/>
+      </w:rPr>
+    </w:lvl>
+    <w:lvl w:ilvl="7" w:tplc="40090003" w:tentative="1">
+      <w:start w:val="1"/>
+      <w:numFmt w:val="bullet"/>
+      <w:lvlText w:val="o"/>
+      <w:lvlJc w:val="left"/>
+      <w:pPr>
+        <w:ind w:left="5760" w:hanging="360"/>
+      </w:pPr>
+      <w:rPr>
+        <w:rFonts w:ascii="Courier New" w:hAnsi="Courier New" w:cs="Courier New" w:hint="default"/>
+      </w:rPr>
+    </w:lvl>
+    <w:lvl w:ilvl="8" w:tplc="40090005" w:tentative="1">
+      <w:start w:val="1"/>
+      <w:numFmt w:val="bullet"/>
+      <w:lvlText w:val=""/>
+      <w:lvlJc w:val="left"/>
+      <w:pPr>
+        <w:ind w:left="6480" w:hanging="360"/>
+      </w:pPr>
+      <w:rPr>
+        <w:rFonts w:ascii="Wingdings" w:hAnsi="Wingdings" w:hint="default"/>
+      </w:rPr>
+    </w:lvl>
+  </w:abstractNum>
+  <w:abstractNum w:abstractNumId="1" w15:restartNumberingAfterBreak="0">
     <w:nsid w:val="05DC04AE"/>
     <w:multiLevelType w:val="hybridMultilevel"/>
     <w:tmpl w:val="8F067CD6"/>
@@ -2003,7 +3145,120 @@
       </w:pPr>
     </w:lvl>
   </w:abstractNum>
-  <w:abstractNum w:abstractNumId="1" w15:restartNumberingAfterBreak="0">
+  <w:abstractNum w:abstractNumId="2" w15:restartNumberingAfterBreak="0">
+    <w:nsid w:val="07FA29C2"/>
+    <w:multiLevelType w:val="hybridMultilevel"/>
+    <w:tmpl w:val="6C7C596A"/>
+    <w:lvl w:ilvl="0" w:tplc="40090001">
+      <w:start w:val="1"/>
+      <w:numFmt w:val="bullet"/>
+      <w:lvlText w:val=""/>
+      <w:lvlJc w:val="left"/>
+      <w:pPr>
+        <w:ind w:left="720" w:hanging="360"/>
+      </w:pPr>
+      <w:rPr>
+        <w:rFonts w:ascii="Symbol" w:hAnsi="Symbol" w:hint="default"/>
+      </w:rPr>
+    </w:lvl>
+    <w:lvl w:ilvl="1" w:tplc="40090003">
+      <w:start w:val="1"/>
+      <w:numFmt w:val="bullet"/>
+      <w:lvlText w:val="o"/>
+      <w:lvlJc w:val="left"/>
+      <w:pPr>
+        <w:ind w:left="1440" w:hanging="360"/>
+      </w:pPr>
+      <w:rPr>
+        <w:rFonts w:ascii="Courier New" w:hAnsi="Courier New" w:cs="Courier New" w:hint="default"/>
+      </w:rPr>
+    </w:lvl>
+    <w:lvl w:ilvl="2" w:tplc="40090005">
+      <w:start w:val="1"/>
+      <w:numFmt w:val="bullet"/>
+      <w:lvlText w:val=""/>
+      <w:lvlJc w:val="left"/>
+      <w:pPr>
+        <w:ind w:left="2160" w:hanging="360"/>
+      </w:pPr>
+      <w:rPr>
+        <w:rFonts w:ascii="Wingdings" w:hAnsi="Wingdings" w:hint="default"/>
+      </w:rPr>
+    </w:lvl>
+    <w:lvl w:ilvl="3" w:tplc="40090001" w:tentative="1">
+      <w:start w:val="1"/>
+      <w:numFmt w:val="bullet"/>
+      <w:lvlText w:val=""/>
+      <w:lvlJc w:val="left"/>
+      <w:pPr>
+        <w:ind w:left="2880" w:hanging="360"/>
+      </w:pPr>
+      <w:rPr>
+        <w:rFonts w:ascii="Symbol" w:hAnsi="Symbol" w:hint="default"/>
+      </w:rPr>
+    </w:lvl>
+    <w:lvl w:ilvl="4" w:tplc="40090003" w:tentative="1">
+      <w:start w:val="1"/>
+      <w:numFmt w:val="bullet"/>
+      <w:lvlText w:val="o"/>
+      <w:lvlJc w:val="left"/>
+      <w:pPr>
+        <w:ind w:left="3600" w:hanging="360"/>
+      </w:pPr>
+      <w:rPr>
+        <w:rFonts w:ascii="Courier New" w:hAnsi="Courier New" w:cs="Courier New" w:hint="default"/>
+      </w:rPr>
+    </w:lvl>
+    <w:lvl w:ilvl="5" w:tplc="40090005" w:tentative="1">
+      <w:start w:val="1"/>
+      <w:numFmt w:val="bullet"/>
+      <w:lvlText w:val=""/>
+      <w:lvlJc w:val="left"/>
+      <w:pPr>
+        <w:ind w:left="4320" w:hanging="360"/>
+      </w:pPr>
+      <w:rPr>
+        <w:rFonts w:ascii="Wingdings" w:hAnsi="Wingdings" w:hint="default"/>
+      </w:rPr>
+    </w:lvl>
+    <w:lvl w:ilvl="6" w:tplc="40090001" w:tentative="1">
+      <w:start w:val="1"/>
+      <w:numFmt w:val="bullet"/>
+      <w:lvlText w:val=""/>
+      <w:lvlJc w:val="left"/>
+      <w:pPr>
+        <w:ind w:left="5040" w:hanging="360"/>
+      </w:pPr>
+      <w:rPr>
+        <w:rFonts w:ascii="Symbol" w:hAnsi="Symbol" w:hint="default"/>
+      </w:rPr>
+    </w:lvl>
+    <w:lvl w:ilvl="7" w:tplc="40090003" w:tentative="1">
+      <w:start w:val="1"/>
+      <w:numFmt w:val="bullet"/>
+      <w:lvlText w:val="o"/>
+      <w:lvlJc w:val="left"/>
+      <w:pPr>
+        <w:ind w:left="5760" w:hanging="360"/>
+      </w:pPr>
+      <w:rPr>
+        <w:rFonts w:ascii="Courier New" w:hAnsi="Courier New" w:cs="Courier New" w:hint="default"/>
+      </w:rPr>
+    </w:lvl>
+    <w:lvl w:ilvl="8" w:tplc="40090005" w:tentative="1">
+      <w:start w:val="1"/>
+      <w:numFmt w:val="bullet"/>
+      <w:lvlText w:val=""/>
+      <w:lvlJc w:val="left"/>
+      <w:pPr>
+        <w:ind w:left="6480" w:hanging="360"/>
+      </w:pPr>
+      <w:rPr>
+        <w:rFonts w:ascii="Wingdings" w:hAnsi="Wingdings" w:hint="default"/>
+      </w:rPr>
+    </w:lvl>
+  </w:abstractNum>
+  <w:abstractNum w:abstractNumId="3" w15:restartNumberingAfterBreak="0">
     <w:nsid w:val="0C0C5C67"/>
     <w:multiLevelType w:val="hybridMultilevel"/>
     <w:tmpl w:val="5924474E"/>
@@ -2089,7 +3344,7 @@
       </w:pPr>
     </w:lvl>
   </w:abstractNum>
-  <w:abstractNum w:abstractNumId="2" w15:restartNumberingAfterBreak="0">
+  <w:abstractNum w:abstractNumId="4" w15:restartNumberingAfterBreak="0">
     <w:nsid w:val="1039038F"/>
     <w:multiLevelType w:val="hybridMultilevel"/>
     <w:tmpl w:val="4AF28FCE"/>
@@ -2202,7 +3457,7 @@
       </w:rPr>
     </w:lvl>
   </w:abstractNum>
-  <w:abstractNum w:abstractNumId="3" w15:restartNumberingAfterBreak="0">
+  <w:abstractNum w:abstractNumId="5" w15:restartNumberingAfterBreak="0">
     <w:nsid w:val="12F73C13"/>
     <w:multiLevelType w:val="hybridMultilevel"/>
     <w:tmpl w:val="A456F852"/>
@@ -2315,7 +3570,7 @@
       </w:rPr>
     </w:lvl>
   </w:abstractNum>
-  <w:abstractNum w:abstractNumId="4" w15:restartNumberingAfterBreak="0">
+  <w:abstractNum w:abstractNumId="6" w15:restartNumberingAfterBreak="0">
     <w:nsid w:val="1C4F2E27"/>
     <w:multiLevelType w:val="hybridMultilevel"/>
     <w:tmpl w:val="A8D0E3AA"/>
@@ -2401,7 +3656,120 @@
       </w:pPr>
     </w:lvl>
   </w:abstractNum>
-  <w:abstractNum w:abstractNumId="5" w15:restartNumberingAfterBreak="0">
+  <w:abstractNum w:abstractNumId="7" w15:restartNumberingAfterBreak="0">
+    <w:nsid w:val="1C936017"/>
+    <w:multiLevelType w:val="hybridMultilevel"/>
+    <w:tmpl w:val="4844B798"/>
+    <w:lvl w:ilvl="0" w:tplc="40090001">
+      <w:start w:val="1"/>
+      <w:numFmt w:val="bullet"/>
+      <w:lvlText w:val=""/>
+      <w:lvlJc w:val="left"/>
+      <w:pPr>
+        <w:ind w:left="720" w:hanging="360"/>
+      </w:pPr>
+      <w:rPr>
+        <w:rFonts w:ascii="Symbol" w:hAnsi="Symbol" w:hint="default"/>
+      </w:rPr>
+    </w:lvl>
+    <w:lvl w:ilvl="1" w:tplc="40090003" w:tentative="1">
+      <w:start w:val="1"/>
+      <w:numFmt w:val="bullet"/>
+      <w:lvlText w:val="o"/>
+      <w:lvlJc w:val="left"/>
+      <w:pPr>
+        <w:ind w:left="1440" w:hanging="360"/>
+      </w:pPr>
+      <w:rPr>
+        <w:rFonts w:ascii="Courier New" w:hAnsi="Courier New" w:cs="Courier New" w:hint="default"/>
+      </w:rPr>
+    </w:lvl>
+    <w:lvl w:ilvl="2" w:tplc="40090005" w:tentative="1">
+      <w:start w:val="1"/>
+      <w:numFmt w:val="bullet"/>
+      <w:lvlText w:val=""/>
+      <w:lvlJc w:val="left"/>
+      <w:pPr>
+        <w:ind w:left="2160" w:hanging="360"/>
+      </w:pPr>
+      <w:rPr>
+        <w:rFonts w:ascii="Wingdings" w:hAnsi="Wingdings" w:hint="default"/>
+      </w:rPr>
+    </w:lvl>
+    <w:lvl w:ilvl="3" w:tplc="40090001" w:tentative="1">
+      <w:start w:val="1"/>
+      <w:numFmt w:val="bullet"/>
+      <w:lvlText w:val=""/>
+      <w:lvlJc w:val="left"/>
+      <w:pPr>
+        <w:ind w:left="2880" w:hanging="360"/>
+      </w:pPr>
+      <w:rPr>
+        <w:rFonts w:ascii="Symbol" w:hAnsi="Symbol" w:hint="default"/>
+      </w:rPr>
+    </w:lvl>
+    <w:lvl w:ilvl="4" w:tplc="40090003" w:tentative="1">
+      <w:start w:val="1"/>
+      <w:numFmt w:val="bullet"/>
+      <w:lvlText w:val="o"/>
+      <w:lvlJc w:val="left"/>
+      <w:pPr>
+        <w:ind w:left="3600" w:hanging="360"/>
+      </w:pPr>
+      <w:rPr>
+        <w:rFonts w:ascii="Courier New" w:hAnsi="Courier New" w:cs="Courier New" w:hint="default"/>
+      </w:rPr>
+    </w:lvl>
+    <w:lvl w:ilvl="5" w:tplc="40090005" w:tentative="1">
+      <w:start w:val="1"/>
+      <w:numFmt w:val="bullet"/>
+      <w:lvlText w:val=""/>
+      <w:lvlJc w:val="left"/>
+      <w:pPr>
+        <w:ind w:left="4320" w:hanging="360"/>
+      </w:pPr>
+      <w:rPr>
+        <w:rFonts w:ascii="Wingdings" w:hAnsi="Wingdings" w:hint="default"/>
+      </w:rPr>
+    </w:lvl>
+    <w:lvl w:ilvl="6" w:tplc="40090001" w:tentative="1">
+      <w:start w:val="1"/>
+      <w:numFmt w:val="bullet"/>
+      <w:lvlText w:val=""/>
+      <w:lvlJc w:val="left"/>
+      <w:pPr>
+        <w:ind w:left="5040" w:hanging="360"/>
+      </w:pPr>
+      <w:rPr>
+        <w:rFonts w:ascii="Symbol" w:hAnsi="Symbol" w:hint="default"/>
+      </w:rPr>
+    </w:lvl>
+    <w:lvl w:ilvl="7" w:tplc="40090003" w:tentative="1">
+      <w:start w:val="1"/>
+      <w:numFmt w:val="bullet"/>
+      <w:lvlText w:val="o"/>
+      <w:lvlJc w:val="left"/>
+      <w:pPr>
+        <w:ind w:left="5760" w:hanging="360"/>
+      </w:pPr>
+      <w:rPr>
+        <w:rFonts w:ascii="Courier New" w:hAnsi="Courier New" w:cs="Courier New" w:hint="default"/>
+      </w:rPr>
+    </w:lvl>
+    <w:lvl w:ilvl="8" w:tplc="40090005" w:tentative="1">
+      <w:start w:val="1"/>
+      <w:numFmt w:val="bullet"/>
+      <w:lvlText w:val=""/>
+      <w:lvlJc w:val="left"/>
+      <w:pPr>
+        <w:ind w:left="6480" w:hanging="360"/>
+      </w:pPr>
+      <w:rPr>
+        <w:rFonts w:ascii="Wingdings" w:hAnsi="Wingdings" w:hint="default"/>
+      </w:rPr>
+    </w:lvl>
+  </w:abstractNum>
+  <w:abstractNum w:abstractNumId="8" w15:restartNumberingAfterBreak="0">
     <w:nsid w:val="23C02DA6"/>
     <w:multiLevelType w:val="hybridMultilevel"/>
     <w:tmpl w:val="0DC828C4"/>
@@ -2487,7 +3855,7 @@
       </w:pPr>
     </w:lvl>
   </w:abstractNum>
-  <w:abstractNum w:abstractNumId="6" w15:restartNumberingAfterBreak="0">
+  <w:abstractNum w:abstractNumId="9" w15:restartNumberingAfterBreak="0">
     <w:nsid w:val="41AD58C6"/>
     <w:multiLevelType w:val="multilevel"/>
     <w:tmpl w:val="7E38A916"/>
@@ -2600,7 +3968,7 @@
       </w:rPr>
     </w:lvl>
   </w:abstractNum>
-  <w:abstractNum w:abstractNumId="7" w15:restartNumberingAfterBreak="0">
+  <w:abstractNum w:abstractNumId="10" w15:restartNumberingAfterBreak="0">
     <w:nsid w:val="431D7608"/>
     <w:multiLevelType w:val="hybridMultilevel"/>
     <w:tmpl w:val="C5E69A72"/>
@@ -2713,7 +4081,7 @@
       </w:rPr>
     </w:lvl>
   </w:abstractNum>
-  <w:abstractNum w:abstractNumId="8" w15:restartNumberingAfterBreak="0">
+  <w:abstractNum w:abstractNumId="11" w15:restartNumberingAfterBreak="0">
     <w:nsid w:val="4A8F11C9"/>
     <w:multiLevelType w:val="hybridMultilevel"/>
     <w:tmpl w:val="08621260"/>
@@ -2799,7 +4167,518 @@
       </w:pPr>
     </w:lvl>
   </w:abstractNum>
-  <w:abstractNum w:abstractNumId="9" w15:restartNumberingAfterBreak="0">
+  <w:abstractNum w:abstractNumId="12" w15:restartNumberingAfterBreak="0">
+    <w:nsid w:val="4ED20252"/>
+    <w:multiLevelType w:val="hybridMultilevel"/>
+    <w:tmpl w:val="5080C704"/>
+    <w:lvl w:ilvl="0" w:tplc="4009000F">
+      <w:start w:val="1"/>
+      <w:numFmt w:val="decimal"/>
+      <w:lvlText w:val="%1."/>
+      <w:lvlJc w:val="left"/>
+      <w:pPr>
+        <w:ind w:left="720" w:hanging="360"/>
+      </w:pPr>
+    </w:lvl>
+    <w:lvl w:ilvl="1" w:tplc="40090019" w:tentative="1">
+      <w:start w:val="1"/>
+      <w:numFmt w:val="lowerLetter"/>
+      <w:lvlText w:val="%2."/>
+      <w:lvlJc w:val="left"/>
+      <w:pPr>
+        <w:ind w:left="1440" w:hanging="360"/>
+      </w:pPr>
+    </w:lvl>
+    <w:lvl w:ilvl="2" w:tplc="4009001B" w:tentative="1">
+      <w:start w:val="1"/>
+      <w:numFmt w:val="lowerRoman"/>
+      <w:lvlText w:val="%3."/>
+      <w:lvlJc w:val="right"/>
+      <w:pPr>
+        <w:ind w:left="2160" w:hanging="180"/>
+      </w:pPr>
+    </w:lvl>
+    <w:lvl w:ilvl="3" w:tplc="4009000F" w:tentative="1">
+      <w:start w:val="1"/>
+      <w:numFmt w:val="decimal"/>
+      <w:lvlText w:val="%4."/>
+      <w:lvlJc w:val="left"/>
+      <w:pPr>
+        <w:ind w:left="2880" w:hanging="360"/>
+      </w:pPr>
+    </w:lvl>
+    <w:lvl w:ilvl="4" w:tplc="40090019" w:tentative="1">
+      <w:start w:val="1"/>
+      <w:numFmt w:val="lowerLetter"/>
+      <w:lvlText w:val="%5."/>
+      <w:lvlJc w:val="left"/>
+      <w:pPr>
+        <w:ind w:left="3600" w:hanging="360"/>
+      </w:pPr>
+    </w:lvl>
+    <w:lvl w:ilvl="5" w:tplc="4009001B" w:tentative="1">
+      <w:start w:val="1"/>
+      <w:numFmt w:val="lowerRoman"/>
+      <w:lvlText w:val="%6."/>
+      <w:lvlJc w:val="right"/>
+      <w:pPr>
+        <w:ind w:left="4320" w:hanging="180"/>
+      </w:pPr>
+    </w:lvl>
+    <w:lvl w:ilvl="6" w:tplc="4009000F" w:tentative="1">
+      <w:start w:val="1"/>
+      <w:numFmt w:val="decimal"/>
+      <w:lvlText w:val="%7."/>
+      <w:lvlJc w:val="left"/>
+      <w:pPr>
+        <w:ind w:left="5040" w:hanging="360"/>
+      </w:pPr>
+    </w:lvl>
+    <w:lvl w:ilvl="7" w:tplc="40090019" w:tentative="1">
+      <w:start w:val="1"/>
+      <w:numFmt w:val="lowerLetter"/>
+      <w:lvlText w:val="%8."/>
+      <w:lvlJc w:val="left"/>
+      <w:pPr>
+        <w:ind w:left="5760" w:hanging="360"/>
+      </w:pPr>
+    </w:lvl>
+    <w:lvl w:ilvl="8" w:tplc="4009001B" w:tentative="1">
+      <w:start w:val="1"/>
+      <w:numFmt w:val="lowerRoman"/>
+      <w:lvlText w:val="%9."/>
+      <w:lvlJc w:val="right"/>
+      <w:pPr>
+        <w:ind w:left="6480" w:hanging="180"/>
+      </w:pPr>
+    </w:lvl>
+  </w:abstractNum>
+  <w:abstractNum w:abstractNumId="13" w15:restartNumberingAfterBreak="0">
+    <w:nsid w:val="4F0B2763"/>
+    <w:multiLevelType w:val="hybridMultilevel"/>
+    <w:tmpl w:val="6B24D6BE"/>
+    <w:lvl w:ilvl="0" w:tplc="40090001">
+      <w:start w:val="1"/>
+      <w:numFmt w:val="bullet"/>
+      <w:lvlText w:val=""/>
+      <w:lvlJc w:val="left"/>
+      <w:pPr>
+        <w:ind w:left="720" w:hanging="360"/>
+      </w:pPr>
+      <w:rPr>
+        <w:rFonts w:ascii="Symbol" w:hAnsi="Symbol" w:hint="default"/>
+      </w:rPr>
+    </w:lvl>
+    <w:lvl w:ilvl="1" w:tplc="40090003" w:tentative="1">
+      <w:start w:val="1"/>
+      <w:numFmt w:val="bullet"/>
+      <w:lvlText w:val="o"/>
+      <w:lvlJc w:val="left"/>
+      <w:pPr>
+        <w:ind w:left="1440" w:hanging="360"/>
+      </w:pPr>
+      <w:rPr>
+        <w:rFonts w:ascii="Courier New" w:hAnsi="Courier New" w:cs="Courier New" w:hint="default"/>
+      </w:rPr>
+    </w:lvl>
+    <w:lvl w:ilvl="2" w:tplc="40090005" w:tentative="1">
+      <w:start w:val="1"/>
+      <w:numFmt w:val="bullet"/>
+      <w:lvlText w:val=""/>
+      <w:lvlJc w:val="left"/>
+      <w:pPr>
+        <w:ind w:left="2160" w:hanging="360"/>
+      </w:pPr>
+      <w:rPr>
+        <w:rFonts w:ascii="Wingdings" w:hAnsi="Wingdings" w:hint="default"/>
+      </w:rPr>
+    </w:lvl>
+    <w:lvl w:ilvl="3" w:tplc="40090001" w:tentative="1">
+      <w:start w:val="1"/>
+      <w:numFmt w:val="bullet"/>
+      <w:lvlText w:val=""/>
+      <w:lvlJc w:val="left"/>
+      <w:pPr>
+        <w:ind w:left="2880" w:hanging="360"/>
+      </w:pPr>
+      <w:rPr>
+        <w:rFonts w:ascii="Symbol" w:hAnsi="Symbol" w:hint="default"/>
+      </w:rPr>
+    </w:lvl>
+    <w:lvl w:ilvl="4" w:tplc="40090003" w:tentative="1">
+      <w:start w:val="1"/>
+      <w:numFmt w:val="bullet"/>
+      <w:lvlText w:val="o"/>
+      <w:lvlJc w:val="left"/>
+      <w:pPr>
+        <w:ind w:left="3600" w:hanging="360"/>
+      </w:pPr>
+      <w:rPr>
+        <w:rFonts w:ascii="Courier New" w:hAnsi="Courier New" w:cs="Courier New" w:hint="default"/>
+      </w:rPr>
+    </w:lvl>
+    <w:lvl w:ilvl="5" w:tplc="40090005" w:tentative="1">
+      <w:start w:val="1"/>
+      <w:numFmt w:val="bullet"/>
+      <w:lvlText w:val=""/>
+      <w:lvlJc w:val="left"/>
+      <w:pPr>
+        <w:ind w:left="4320" w:hanging="360"/>
+      </w:pPr>
+      <w:rPr>
+        <w:rFonts w:ascii="Wingdings" w:hAnsi="Wingdings" w:hint="default"/>
+      </w:rPr>
+    </w:lvl>
+    <w:lvl w:ilvl="6" w:tplc="40090001" w:tentative="1">
+      <w:start w:val="1"/>
+      <w:numFmt w:val="bullet"/>
+      <w:lvlText w:val=""/>
+      <w:lvlJc w:val="left"/>
+      <w:pPr>
+        <w:ind w:left="5040" w:hanging="360"/>
+      </w:pPr>
+      <w:rPr>
+        <w:rFonts w:ascii="Symbol" w:hAnsi="Symbol" w:hint="default"/>
+      </w:rPr>
+    </w:lvl>
+    <w:lvl w:ilvl="7" w:tplc="40090003" w:tentative="1">
+      <w:start w:val="1"/>
+      <w:numFmt w:val="bullet"/>
+      <w:lvlText w:val="o"/>
+      <w:lvlJc w:val="left"/>
+      <w:pPr>
+        <w:ind w:left="5760" w:hanging="360"/>
+      </w:pPr>
+      <w:rPr>
+        <w:rFonts w:ascii="Courier New" w:hAnsi="Courier New" w:cs="Courier New" w:hint="default"/>
+      </w:rPr>
+    </w:lvl>
+    <w:lvl w:ilvl="8" w:tplc="40090005" w:tentative="1">
+      <w:start w:val="1"/>
+      <w:numFmt w:val="bullet"/>
+      <w:lvlText w:val=""/>
+      <w:lvlJc w:val="left"/>
+      <w:pPr>
+        <w:ind w:left="6480" w:hanging="360"/>
+      </w:pPr>
+      <w:rPr>
+        <w:rFonts w:ascii="Wingdings" w:hAnsi="Wingdings" w:hint="default"/>
+      </w:rPr>
+    </w:lvl>
+  </w:abstractNum>
+  <w:abstractNum w:abstractNumId="14" w15:restartNumberingAfterBreak="0">
+    <w:nsid w:val="56C46957"/>
+    <w:multiLevelType w:val="hybridMultilevel"/>
+    <w:tmpl w:val="1D52446E"/>
+    <w:lvl w:ilvl="0" w:tplc="40090001">
+      <w:start w:val="1"/>
+      <w:numFmt w:val="bullet"/>
+      <w:lvlText w:val=""/>
+      <w:lvlJc w:val="left"/>
+      <w:pPr>
+        <w:ind w:left="720" w:hanging="360"/>
+      </w:pPr>
+      <w:rPr>
+        <w:rFonts w:ascii="Symbol" w:hAnsi="Symbol" w:hint="default"/>
+      </w:rPr>
+    </w:lvl>
+    <w:lvl w:ilvl="1" w:tplc="40090003">
+      <w:start w:val="1"/>
+      <w:numFmt w:val="bullet"/>
+      <w:lvlText w:val="o"/>
+      <w:lvlJc w:val="left"/>
+      <w:pPr>
+        <w:ind w:left="1440" w:hanging="360"/>
+      </w:pPr>
+      <w:rPr>
+        <w:rFonts w:ascii="Courier New" w:hAnsi="Courier New" w:cs="Courier New" w:hint="default"/>
+      </w:rPr>
+    </w:lvl>
+    <w:lvl w:ilvl="2" w:tplc="40090005" w:tentative="1">
+      <w:start w:val="1"/>
+      <w:numFmt w:val="bullet"/>
+      <w:lvlText w:val=""/>
+      <w:lvlJc w:val="left"/>
+      <w:pPr>
+        <w:ind w:left="2160" w:hanging="360"/>
+      </w:pPr>
+      <w:rPr>
+        <w:rFonts w:ascii="Wingdings" w:hAnsi="Wingdings" w:hint="default"/>
+      </w:rPr>
+    </w:lvl>
+    <w:lvl w:ilvl="3" w:tplc="40090001" w:tentative="1">
+      <w:start w:val="1"/>
+      <w:numFmt w:val="bullet"/>
+      <w:lvlText w:val=""/>
+      <w:lvlJc w:val="left"/>
+      <w:pPr>
+        <w:ind w:left="2880" w:hanging="360"/>
+      </w:pPr>
+      <w:rPr>
+        <w:rFonts w:ascii="Symbol" w:hAnsi="Symbol" w:hint="default"/>
+      </w:rPr>
+    </w:lvl>
+    <w:lvl w:ilvl="4" w:tplc="40090003" w:tentative="1">
+      <w:start w:val="1"/>
+      <w:numFmt w:val="bullet"/>
+      <w:lvlText w:val="o"/>
+      <w:lvlJc w:val="left"/>
+      <w:pPr>
+        <w:ind w:left="3600" w:hanging="360"/>
+      </w:pPr>
+      <w:rPr>
+        <w:rFonts w:ascii="Courier New" w:hAnsi="Courier New" w:cs="Courier New" w:hint="default"/>
+      </w:rPr>
+    </w:lvl>
+    <w:lvl w:ilvl="5" w:tplc="40090005" w:tentative="1">
+      <w:start w:val="1"/>
+      <w:numFmt w:val="bullet"/>
+      <w:lvlText w:val=""/>
+      <w:lvlJc w:val="left"/>
+      <w:pPr>
+        <w:ind w:left="4320" w:hanging="360"/>
+      </w:pPr>
+      <w:rPr>
+        <w:rFonts w:ascii="Wingdings" w:hAnsi="Wingdings" w:hint="default"/>
+      </w:rPr>
+    </w:lvl>
+    <w:lvl w:ilvl="6" w:tplc="40090001" w:tentative="1">
+      <w:start w:val="1"/>
+      <w:numFmt w:val="bullet"/>
+      <w:lvlText w:val=""/>
+      <w:lvlJc w:val="left"/>
+      <w:pPr>
+        <w:ind w:left="5040" w:hanging="360"/>
+      </w:pPr>
+      <w:rPr>
+        <w:rFonts w:ascii="Symbol" w:hAnsi="Symbol" w:hint="default"/>
+      </w:rPr>
+    </w:lvl>
+    <w:lvl w:ilvl="7" w:tplc="40090003" w:tentative="1">
+      <w:start w:val="1"/>
+      <w:numFmt w:val="bullet"/>
+      <w:lvlText w:val="o"/>
+      <w:lvlJc w:val="left"/>
+      <w:pPr>
+        <w:ind w:left="5760" w:hanging="360"/>
+      </w:pPr>
+      <w:rPr>
+        <w:rFonts w:ascii="Courier New" w:hAnsi="Courier New" w:cs="Courier New" w:hint="default"/>
+      </w:rPr>
+    </w:lvl>
+    <w:lvl w:ilvl="8" w:tplc="40090005" w:tentative="1">
+      <w:start w:val="1"/>
+      <w:numFmt w:val="bullet"/>
+      <w:lvlText w:val=""/>
+      <w:lvlJc w:val="left"/>
+      <w:pPr>
+        <w:ind w:left="6480" w:hanging="360"/>
+      </w:pPr>
+      <w:rPr>
+        <w:rFonts w:ascii="Wingdings" w:hAnsi="Wingdings" w:hint="default"/>
+      </w:rPr>
+    </w:lvl>
+  </w:abstractNum>
+  <w:abstractNum w:abstractNumId="15" w15:restartNumberingAfterBreak="0">
+    <w:nsid w:val="70FC340C"/>
+    <w:multiLevelType w:val="hybridMultilevel"/>
+    <w:tmpl w:val="D91C80BE"/>
+    <w:lvl w:ilvl="0" w:tplc="4009000F">
+      <w:start w:val="1"/>
+      <w:numFmt w:val="decimal"/>
+      <w:lvlText w:val="%1."/>
+      <w:lvlJc w:val="left"/>
+      <w:pPr>
+        <w:ind w:left="720" w:hanging="360"/>
+      </w:pPr>
+    </w:lvl>
+    <w:lvl w:ilvl="1" w:tplc="40090019" w:tentative="1">
+      <w:start w:val="1"/>
+      <w:numFmt w:val="lowerLetter"/>
+      <w:lvlText w:val="%2."/>
+      <w:lvlJc w:val="left"/>
+      <w:pPr>
+        <w:ind w:left="1440" w:hanging="360"/>
+      </w:pPr>
+    </w:lvl>
+    <w:lvl w:ilvl="2" w:tplc="4009001B" w:tentative="1">
+      <w:start w:val="1"/>
+      <w:numFmt w:val="lowerRoman"/>
+      <w:lvlText w:val="%3."/>
+      <w:lvlJc w:val="right"/>
+      <w:pPr>
+        <w:ind w:left="2160" w:hanging="180"/>
+      </w:pPr>
+    </w:lvl>
+    <w:lvl w:ilvl="3" w:tplc="4009000F" w:tentative="1">
+      <w:start w:val="1"/>
+      <w:numFmt w:val="decimal"/>
+      <w:lvlText w:val="%4."/>
+      <w:lvlJc w:val="left"/>
+      <w:pPr>
+        <w:ind w:left="2880" w:hanging="360"/>
+      </w:pPr>
+    </w:lvl>
+    <w:lvl w:ilvl="4" w:tplc="40090019" w:tentative="1">
+      <w:start w:val="1"/>
+      <w:numFmt w:val="lowerLetter"/>
+      <w:lvlText w:val="%5."/>
+      <w:lvlJc w:val="left"/>
+      <w:pPr>
+        <w:ind w:left="3600" w:hanging="360"/>
+      </w:pPr>
+    </w:lvl>
+    <w:lvl w:ilvl="5" w:tplc="4009001B" w:tentative="1">
+      <w:start w:val="1"/>
+      <w:numFmt w:val="lowerRoman"/>
+      <w:lvlText w:val="%6."/>
+      <w:lvlJc w:val="right"/>
+      <w:pPr>
+        <w:ind w:left="4320" w:hanging="180"/>
+      </w:pPr>
+    </w:lvl>
+    <w:lvl w:ilvl="6" w:tplc="4009000F" w:tentative="1">
+      <w:start w:val="1"/>
+      <w:numFmt w:val="decimal"/>
+      <w:lvlText w:val="%7."/>
+      <w:lvlJc w:val="left"/>
+      <w:pPr>
+        <w:ind w:left="5040" w:hanging="360"/>
+      </w:pPr>
+    </w:lvl>
+    <w:lvl w:ilvl="7" w:tplc="40090019" w:tentative="1">
+      <w:start w:val="1"/>
+      <w:numFmt w:val="lowerLetter"/>
+      <w:lvlText w:val="%8."/>
+      <w:lvlJc w:val="left"/>
+      <w:pPr>
+        <w:ind w:left="5760" w:hanging="360"/>
+      </w:pPr>
+    </w:lvl>
+    <w:lvl w:ilvl="8" w:tplc="4009001B" w:tentative="1">
+      <w:start w:val="1"/>
+      <w:numFmt w:val="lowerRoman"/>
+      <w:lvlText w:val="%9."/>
+      <w:lvlJc w:val="right"/>
+      <w:pPr>
+        <w:ind w:left="6480" w:hanging="180"/>
+      </w:pPr>
+    </w:lvl>
+  </w:abstractNum>
+  <w:abstractNum w:abstractNumId="16" w15:restartNumberingAfterBreak="0">
+    <w:nsid w:val="749305D2"/>
+    <w:multiLevelType w:val="hybridMultilevel"/>
+    <w:tmpl w:val="FAE02A4E"/>
+    <w:lvl w:ilvl="0" w:tplc="40090001">
+      <w:start w:val="1"/>
+      <w:numFmt w:val="bullet"/>
+      <w:lvlText w:val=""/>
+      <w:lvlJc w:val="left"/>
+      <w:pPr>
+        <w:ind w:left="720" w:hanging="360"/>
+      </w:pPr>
+      <w:rPr>
+        <w:rFonts w:ascii="Symbol" w:hAnsi="Symbol" w:hint="default"/>
+      </w:rPr>
+    </w:lvl>
+    <w:lvl w:ilvl="1" w:tplc="40090003" w:tentative="1">
+      <w:start w:val="1"/>
+      <w:numFmt w:val="bullet"/>
+      <w:lvlText w:val="o"/>
+      <w:lvlJc w:val="left"/>
+      <w:pPr>
+        <w:ind w:left="1440" w:hanging="360"/>
+      </w:pPr>
+      <w:rPr>
+        <w:rFonts w:ascii="Courier New" w:hAnsi="Courier New" w:cs="Courier New" w:hint="default"/>
+      </w:rPr>
+    </w:lvl>
+    <w:lvl w:ilvl="2" w:tplc="40090005" w:tentative="1">
+      <w:start w:val="1"/>
+      <w:numFmt w:val="bullet"/>
+      <w:lvlText w:val=""/>
+      <w:lvlJc w:val="left"/>
+      <w:pPr>
+        <w:ind w:left="2160" w:hanging="360"/>
+      </w:pPr>
+      <w:rPr>
+        <w:rFonts w:ascii="Wingdings" w:hAnsi="Wingdings" w:hint="default"/>
+      </w:rPr>
+    </w:lvl>
+    <w:lvl w:ilvl="3" w:tplc="40090001" w:tentative="1">
+      <w:start w:val="1"/>
+      <w:numFmt w:val="bullet"/>
+      <w:lvlText w:val=""/>
+      <w:lvlJc w:val="left"/>
+      <w:pPr>
+        <w:ind w:left="2880" w:hanging="360"/>
+      </w:pPr>
+      <w:rPr>
+        <w:rFonts w:ascii="Symbol" w:hAnsi="Symbol" w:hint="default"/>
+      </w:rPr>
+    </w:lvl>
+    <w:lvl w:ilvl="4" w:tplc="40090003" w:tentative="1">
+      <w:start w:val="1"/>
+      <w:numFmt w:val="bullet"/>
+      <w:lvlText w:val="o"/>
+      <w:lvlJc w:val="left"/>
+      <w:pPr>
+        <w:ind w:left="3600" w:hanging="360"/>
+      </w:pPr>
+      <w:rPr>
+        <w:rFonts w:ascii="Courier New" w:hAnsi="Courier New" w:cs="Courier New" w:hint="default"/>
+      </w:rPr>
+    </w:lvl>
+    <w:lvl w:ilvl="5" w:tplc="40090005" w:tentative="1">
+      <w:start w:val="1"/>
+      <w:numFmt w:val="bullet"/>
+      <w:lvlText w:val=""/>
+      <w:lvlJc w:val="left"/>
+      <w:pPr>
+        <w:ind w:left="4320" w:hanging="360"/>
+      </w:pPr>
+      <w:rPr>
+        <w:rFonts w:ascii="Wingdings" w:hAnsi="Wingdings" w:hint="default"/>
+      </w:rPr>
+    </w:lvl>
+    <w:lvl w:ilvl="6" w:tplc="40090001" w:tentative="1">
+      <w:start w:val="1"/>
+      <w:numFmt w:val="bullet"/>
+      <w:lvlText w:val=""/>
+      <w:lvlJc w:val="left"/>
+      <w:pPr>
+        <w:ind w:left="5040" w:hanging="360"/>
+      </w:pPr>
+      <w:rPr>
+        <w:rFonts w:ascii="Symbol" w:hAnsi="Symbol" w:hint="default"/>
+      </w:rPr>
+    </w:lvl>
+    <w:lvl w:ilvl="7" w:tplc="40090003" w:tentative="1">
+      <w:start w:val="1"/>
+      <w:numFmt w:val="bullet"/>
+      <w:lvlText w:val="o"/>
+      <w:lvlJc w:val="left"/>
+      <w:pPr>
+        <w:ind w:left="5760" w:hanging="360"/>
+      </w:pPr>
+      <w:rPr>
+        <w:rFonts w:ascii="Courier New" w:hAnsi="Courier New" w:cs="Courier New" w:hint="default"/>
+      </w:rPr>
+    </w:lvl>
+    <w:lvl w:ilvl="8" w:tplc="40090005" w:tentative="1">
+      <w:start w:val="1"/>
+      <w:numFmt w:val="bullet"/>
+      <w:lvlText w:val=""/>
+      <w:lvlJc w:val="left"/>
+      <w:pPr>
+        <w:ind w:left="6480" w:hanging="360"/>
+      </w:pPr>
+      <w:rPr>
+        <w:rFonts w:ascii="Wingdings" w:hAnsi="Wingdings" w:hint="default"/>
+      </w:rPr>
+    </w:lvl>
+  </w:abstractNum>
+  <w:abstractNum w:abstractNumId="17" w15:restartNumberingAfterBreak="0">
     <w:nsid w:val="74E66899"/>
     <w:multiLevelType w:val="hybridMultilevel"/>
     <w:tmpl w:val="1EF632D0"/>
@@ -2913,34 +4792,58 @@
     </w:lvl>
   </w:abstractNum>
   <w:num w:numId="1" w16cid:durableId="1540973067">
+    <w:abstractNumId w:val="4"/>
+  </w:num>
+  <w:num w:numId="2" w16cid:durableId="499740590">
+    <w:abstractNumId w:val="8"/>
+  </w:num>
+  <w:num w:numId="3" w16cid:durableId="541132239">
+    <w:abstractNumId w:val="3"/>
+  </w:num>
+  <w:num w:numId="4" w16cid:durableId="568883010">
+    <w:abstractNumId w:val="17"/>
+  </w:num>
+  <w:num w:numId="5" w16cid:durableId="845677584">
+    <w:abstractNumId w:val="5"/>
+  </w:num>
+  <w:num w:numId="6" w16cid:durableId="1637027404">
+    <w:abstractNumId w:val="6"/>
+  </w:num>
+  <w:num w:numId="7" w16cid:durableId="1472675406">
+    <w:abstractNumId w:val="1"/>
+  </w:num>
+  <w:num w:numId="8" w16cid:durableId="200286158">
+    <w:abstractNumId w:val="11"/>
+  </w:num>
+  <w:num w:numId="9" w16cid:durableId="1176503610">
+    <w:abstractNumId w:val="10"/>
+  </w:num>
+  <w:num w:numId="10" w16cid:durableId="1796833049">
+    <w:abstractNumId w:val="9"/>
+  </w:num>
+  <w:num w:numId="11" w16cid:durableId="1996957847">
+    <w:abstractNumId w:val="14"/>
+  </w:num>
+  <w:num w:numId="12" w16cid:durableId="2063482358">
+    <w:abstractNumId w:val="12"/>
+  </w:num>
+  <w:num w:numId="13" w16cid:durableId="1546021224">
     <w:abstractNumId w:val="2"/>
   </w:num>
-  <w:num w:numId="2" w16cid:durableId="499740590">
-    <w:abstractNumId w:val="5"/>
+  <w:num w:numId="14" w16cid:durableId="222566674">
+    <w:abstractNumId w:val="16"/>
   </w:num>
-  <w:num w:numId="3" w16cid:durableId="541132239">
-    <w:abstractNumId w:val="1"/>
+  <w:num w:numId="15" w16cid:durableId="1727487960">
+    <w:abstractNumId w:val="7"/>
   </w:num>
-  <w:num w:numId="4" w16cid:durableId="568883010">
-    <w:abstractNumId w:val="9"/>
+  <w:num w:numId="16" w16cid:durableId="444738084">
+    <w:abstractNumId w:val="15"/>
   </w:num>
-  <w:num w:numId="5" w16cid:durableId="845677584">
-    <w:abstractNumId w:val="3"/>
-  </w:num>
-  <w:num w:numId="6" w16cid:durableId="1637027404">
-    <w:abstractNumId w:val="4"/>
-  </w:num>
-  <w:num w:numId="7" w16cid:durableId="1472675406">
+  <w:num w:numId="17" w16cid:durableId="1318805403">
     <w:abstractNumId w:val="0"/>
   </w:num>
-  <w:num w:numId="8" w16cid:durableId="200286158">
-    <w:abstractNumId w:val="8"/>
-  </w:num>
-  <w:num w:numId="9" w16cid:durableId="1176503610">
-    <w:abstractNumId w:val="7"/>
-  </w:num>
-  <w:num w:numId="10" w16cid:durableId="1796833049">
-    <w:abstractNumId w:val="6"/>
+  <w:num w:numId="18" w16cid:durableId="1115296937">
+    <w:abstractNumId w:val="13"/>
   </w:num>
 </w:numbering>
 </file>
@@ -3881,6 +5784,25 @@
     <w:rPr>
       <w:color w:val="666666"/>
     </w:rPr>
+  </w:style>
+  <w:style w:type="table" w:styleId="TableGrid">
+    <w:name w:val="Table Grid"/>
+    <w:basedOn w:val="TableNormal"/>
+    <w:uiPriority w:val="39"/>
+    <w:rsid w:val="00F76247"/>
+    <w:pPr>
+      <w:spacing w:after="0" w:line="240" w:lineRule="auto"/>
+    </w:pPr>
+    <w:tblPr>
+      <w:tblBorders>
+        <w:top w:val="single" w:sz="4" w:space="0" w:color="auto"/>
+        <w:left w:val="single" w:sz="4" w:space="0" w:color="auto"/>
+        <w:bottom w:val="single" w:sz="4" w:space="0" w:color="auto"/>
+        <w:right w:val="single" w:sz="4" w:space="0" w:color="auto"/>
+        <w:insideH w:val="single" w:sz="4" w:space="0" w:color="auto"/>
+        <w:insideV w:val="single" w:sz="4" w:space="0" w:color="auto"/>
+      </w:tblBorders>
+    </w:tblPr>
   </w:style>
 </w:styles>
 </file>

</xml_diff>